<commit_message>
Papildināta datu validācija un komentāri, atjaunots kļūdu žurnāls, derby.log izņemts no repozitorija
</commit_message>
<xml_diff>
--- a/Kludu_zurnals.docx
+++ b/Kludu_zurnals.docx
@@ -1768,7 +1768,7 @@
               <w:jc w:val="center"/>
             </w:pPr>
             <w:r>
-              <w:t>11.</w:t>
+              <w:t xml:space="preserve">11.</w:t>
             </w:r>
           </w:p>
         </w:tc>
@@ -1794,7 +1794,7 @@
               <w:jc w:val="center"/>
             </w:pPr>
             <w:r>
-              <w:t>12.10.2026</w:t>
+              <w:t xml:space="preserve">12.10.2026</w:t>
             </w:r>
           </w:p>
         </w:tc>
@@ -1817,7 +1817,7 @@
           </w:tcPr>
           <w:p>
             <w:r>
-              <w:t>Atkārtots pieteikums tam pašam pasākumam izraisa kļūdu 23505.</w:t>
+              <w:t xml:space="preserve">Atkārtots pieteikums tam pašam pasākumam izraisa kļūdu 23505.</w:t>
             </w:r>
           </w:p>
         </w:tc>
@@ -1840,7 +1840,7 @@
           </w:tcPr>
           <w:p>
             <w:r>
-              <w:t>Tabulā REGISTRACIJAS ir UNIQUE (pasakuma_id, lietotaja_id).</w:t>
+              <w:t xml:space="preserve">Tabulā REGISTRACIJAS ir UNIQUE (pasakuma_id, lietotaja_id).</w:t>
             </w:r>
           </w:p>
         </w:tc>
@@ -1863,7 +1863,7 @@
           </w:tcPr>
           <w:p>
             <w:r>
-              <w:t>saglabatRegistraciju() atgriež false. Poga "Reģistrēties dalībai" vēl nav pievienota.</w:t>
+              <w:t xml:space="preserve">Poga "Reģistrēties dalībai" pievienota. Pirms saglabāšanas jauPieteicies() pārbauda, vai lietotājs jau ir pieteicies, un parāda "Jūs jau esat pieteicies šim pasākumam!".</w:t>
             </w:r>
           </w:p>
         </w:tc>
@@ -1889,7 +1889,752 @@
               <w:jc w:val="center"/>
             </w:pPr>
             <w:r>
-              <w:t>Daļēji</w:t>
+              <w:t xml:space="preserve">Novērsta</w:t>
+            </w:r>
+          </w:p>
+        </w:tc>
+      </w:tr>
+      <w:tr>
+        <w:tc>
+          <w:tcPr>
+            <w:tcW w:w="600" w:type="dxa"/>
+            <w:tcBorders>
+              <w:top w:val="single" w:sz="4" w:space="0" w:color="808080"/>
+              <w:left w:val="single" w:sz="4" w:space="0" w:color="808080"/>
+              <w:bottom w:val="single" w:sz="4" w:space="0" w:color="808080"/>
+              <w:right w:val="single" w:sz="4" w:space="0" w:color="808080"/>
+            </w:tcBorders>
+            <w:tcMar>
+              <w:top w:w="60" w:type="dxa"/>
+              <w:left w:w="80" w:type="dxa"/>
+              <w:bottom w:w="60" w:type="dxa"/>
+              <w:right w:w="80" w:type="dxa"/>
+            </w:tcMar>
+            <w:vAlign w:val="center"/>
+          </w:tcPr>
+          <w:p>
+            <w:pPr>
+              <w:jc w:val="center"/>
+            </w:pPr>
+            <w:r>
+              <w:t xml:space="preserve">12.</w:t>
+            </w:r>
+          </w:p>
+        </w:tc>
+        <w:tc>
+          <w:tcPr>
+            <w:tcW w:w="1250" w:type="dxa"/>
+            <w:tcBorders>
+              <w:top w:val="single" w:sz="4" w:space="0" w:color="808080"/>
+              <w:left w:val="single" w:sz="4" w:space="0" w:color="808080"/>
+              <w:bottom w:val="single" w:sz="4" w:space="0" w:color="808080"/>
+              <w:right w:val="single" w:sz="4" w:space="0" w:color="808080"/>
+            </w:tcBorders>
+            <w:tcMar>
+              <w:top w:w="60" w:type="dxa"/>
+              <w:left w:w="80" w:type="dxa"/>
+              <w:bottom w:w="60" w:type="dxa"/>
+              <w:right w:w="80" w:type="dxa"/>
+            </w:tcMar>
+            <w:vAlign w:val="center"/>
+          </w:tcPr>
+          <w:p>
+            <w:pPr>
+              <w:jc w:val="center"/>
+            </w:pPr>
+            <w:r>
+              <w:t xml:space="preserve">20.10.2026</w:t>
+            </w:r>
+          </w:p>
+        </w:tc>
+        <w:tc>
+          <w:tcPr>
+            <w:tcW w:w="3900" w:type="dxa"/>
+            <w:tcBorders>
+              <w:top w:val="single" w:sz="4" w:space="0" w:color="808080"/>
+              <w:left w:val="single" w:sz="4" w:space="0" w:color="808080"/>
+              <w:bottom w:val="single" w:sz="4" w:space="0" w:color="808080"/>
+              <w:right w:val="single" w:sz="4" w:space="0" w:color="808080"/>
+            </w:tcBorders>
+            <w:tcMar>
+              <w:top w:w="60" w:type="dxa"/>
+              <w:left w:w="80" w:type="dxa"/>
+              <w:bottom w:w="60" w:type="dxa"/>
+              <w:right w:w="80" w:type="dxa"/>
+            </w:tcMar>
+            <w:vAlign w:val="center"/>
+          </w:tcPr>
+          <w:p>
+            <w:r>
+              <w:t xml:space="preserve">Ja datu bāze nav pieslēgta, ielogojoties rāda "Nepareizs lietotājvārds vai parole!".</w:t>
+            </w:r>
+          </w:p>
+        </w:tc>
+        <w:tc>
+          <w:tcPr>
+            <w:tcW w:w="3300" w:type="dxa"/>
+            <w:tcBorders>
+              <w:top w:val="single" w:sz="4" w:space="0" w:color="808080"/>
+              <w:left w:val="single" w:sz="4" w:space="0" w:color="808080"/>
+              <w:bottom w:val="single" w:sz="4" w:space="0" w:color="808080"/>
+              <w:right w:val="single" w:sz="4" w:space="0" w:color="808080"/>
+            </w:tcBorders>
+            <w:tcMar>
+              <w:top w:w="60" w:type="dxa"/>
+              <w:left w:w="80" w:type="dxa"/>
+              <w:bottom w:w="60" w:type="dxa"/>
+              <w:right w:w="80" w:type="dxa"/>
+            </w:tcMar>
+            <w:vAlign w:val="center"/>
+          </w:tcPr>
+          <w:p>
+            <w:r>
+              <w:t xml:space="preserve">atrastLietotaju() atgriež null gan tad, ja lietotāja nav, gan tad, ja nav savienojuma ar datu bāzi.</w:t>
+            </w:r>
+          </w:p>
+        </w:tc>
+        <w:tc>
+          <w:tcPr>
+            <w:tcW w:w="3300" w:type="dxa"/>
+            <w:tcBorders>
+              <w:top w:val="single" w:sz="4" w:space="0" w:color="808080"/>
+              <w:left w:val="single" w:sz="4" w:space="0" w:color="808080"/>
+              <w:bottom w:val="single" w:sz="4" w:space="0" w:color="808080"/>
+              <w:right w:val="single" w:sz="4" w:space="0" w:color="808080"/>
+            </w:tcBorders>
+            <w:tcMar>
+              <w:top w:w="60" w:type="dxa"/>
+              <w:left w:w="80" w:type="dxa"/>
+              <w:bottom w:w="60" w:type="dxa"/>
+              <w:right w:w="80" w:type="dxa"/>
+            </w:tcMar>
+            <w:vAlign w:val="center"/>
+          </w:tcPr>
+          <w:p>
+            <w:r>
+              <w:t xml:space="preserve">GUI atceras, vai pieslēgšanās izdevās (dbPieejama). Ielogojoties un reģistrējoties parāda "Nav savienojuma ar datu bāzi".</w:t>
+            </w:r>
+          </w:p>
+        </w:tc>
+        <w:tc>
+          <w:tcPr>
+            <w:tcW w:w="1100" w:type="dxa"/>
+            <w:tcBorders>
+              <w:top w:val="single" w:sz="4" w:space="0" w:color="808080"/>
+              <w:left w:val="single" w:sz="4" w:space="0" w:color="808080"/>
+              <w:bottom w:val="single" w:sz="4" w:space="0" w:color="808080"/>
+              <w:right w:val="single" w:sz="4" w:space="0" w:color="808080"/>
+            </w:tcBorders>
+            <w:tcMar>
+              <w:top w:w="60" w:type="dxa"/>
+              <w:left w:w="80" w:type="dxa"/>
+              <w:bottom w:w="60" w:type="dxa"/>
+              <w:right w:w="80" w:type="dxa"/>
+            </w:tcMar>
+            <w:vAlign w:val="center"/>
+          </w:tcPr>
+          <w:p>
+            <w:pPr>
+              <w:jc w:val="center"/>
+            </w:pPr>
+            <w:r>
+              <w:t xml:space="preserve">Novērsta</w:t>
+            </w:r>
+          </w:p>
+        </w:tc>
+      </w:tr>
+      <w:tr>
+        <w:tc>
+          <w:tcPr>
+            <w:tcW w:w="600" w:type="dxa"/>
+            <w:tcBorders>
+              <w:top w:val="single" w:sz="4" w:space="0" w:color="808080"/>
+              <w:left w:val="single" w:sz="4" w:space="0" w:color="808080"/>
+              <w:bottom w:val="single" w:sz="4" w:space="0" w:color="808080"/>
+              <w:right w:val="single" w:sz="4" w:space="0" w:color="808080"/>
+            </w:tcBorders>
+            <w:tcMar>
+              <w:top w:w="60" w:type="dxa"/>
+              <w:left w:w="80" w:type="dxa"/>
+              <w:bottom w:w="60" w:type="dxa"/>
+              <w:right w:w="80" w:type="dxa"/>
+            </w:tcMar>
+            <w:vAlign w:val="center"/>
+          </w:tcPr>
+          <w:p>
+            <w:pPr>
+              <w:jc w:val="center"/>
+            </w:pPr>
+            <w:r>
+              <w:t xml:space="preserve">13.</w:t>
+            </w:r>
+          </w:p>
+        </w:tc>
+        <w:tc>
+          <w:tcPr>
+            <w:tcW w:w="1250" w:type="dxa"/>
+            <w:tcBorders>
+              <w:top w:val="single" w:sz="4" w:space="0" w:color="808080"/>
+              <w:left w:val="single" w:sz="4" w:space="0" w:color="808080"/>
+              <w:bottom w:val="single" w:sz="4" w:space="0" w:color="808080"/>
+              <w:right w:val="single" w:sz="4" w:space="0" w:color="808080"/>
+            </w:tcBorders>
+            <w:tcMar>
+              <w:top w:w="60" w:type="dxa"/>
+              <w:left w:w="80" w:type="dxa"/>
+              <w:bottom w:w="60" w:type="dxa"/>
+              <w:right w:w="80" w:type="dxa"/>
+            </w:tcMar>
+            <w:vAlign w:val="center"/>
+          </w:tcPr>
+          <w:p>
+            <w:pPr>
+              <w:jc w:val="center"/>
+            </w:pPr>
+            <w:r>
+              <w:t xml:space="preserve">20.10.2026</w:t>
+            </w:r>
+          </w:p>
+        </w:tc>
+        <w:tc>
+          <w:tcPr>
+            <w:tcW w:w="3900" w:type="dxa"/>
+            <w:tcBorders>
+              <w:top w:val="single" w:sz="4" w:space="0" w:color="808080"/>
+              <w:left w:val="single" w:sz="4" w:space="0" w:color="808080"/>
+              <w:bottom w:val="single" w:sz="4" w:space="0" w:color="808080"/>
+              <w:right w:val="single" w:sz="4" w:space="0" w:color="808080"/>
+            </w:tcBorders>
+            <w:tcMar>
+              <w:top w:w="60" w:type="dxa"/>
+              <w:left w:w="80" w:type="dxa"/>
+              <w:bottom w:w="60" w:type="dxa"/>
+              <w:right w:w="80" w:type="dxa"/>
+            </w:tcMar>
+            <w:vAlign w:val="center"/>
+          </w:tcPr>
+          <w:p>
+            <w:r>
+              <w:t xml:space="preserve">Neparedzētas kļūdas gadījumā lietotājs neko neredz, kļūda parādās tikai konsolē.</w:t>
+            </w:r>
+          </w:p>
+        </w:tc>
+        <w:tc>
+          <w:tcPr>
+            <w:tcW w:w="3300" w:type="dxa"/>
+            <w:tcBorders>
+              <w:top w:val="single" w:sz="4" w:space="0" w:color="808080"/>
+              <w:left w:val="single" w:sz="4" w:space="0" w:color="808080"/>
+              <w:bottom w:val="single" w:sz="4" w:space="0" w:color="808080"/>
+              <w:right w:val="single" w:sz="4" w:space="0" w:color="808080"/>
+            </w:tcBorders>
+            <w:tcMar>
+              <w:top w:w="60" w:type="dxa"/>
+              <w:left w:w="80" w:type="dxa"/>
+              <w:bottom w:w="60" w:type="dxa"/>
+              <w:right w:w="80" w:type="dxa"/>
+            </w:tcMar>
+            <w:vAlign w:val="center"/>
+          </w:tcPr>
+          <w:p>
+            <w:r>
+              <w:t xml:space="preserve">Programmā nebija kļūdu apstrādes augstākajā līmenī.</w:t>
+            </w:r>
+          </w:p>
+        </w:tc>
+        <w:tc>
+          <w:tcPr>
+            <w:tcW w:w="3300" w:type="dxa"/>
+            <w:tcBorders>
+              <w:top w:val="single" w:sz="4" w:space="0" w:color="808080"/>
+              <w:left w:val="single" w:sz="4" w:space="0" w:color="808080"/>
+              <w:bottom w:val="single" w:sz="4" w:space="0" w:color="808080"/>
+              <w:right w:val="single" w:sz="4" w:space="0" w:color="808080"/>
+            </w:tcBorders>
+            <w:tcMar>
+              <w:top w:w="60" w:type="dxa"/>
+              <w:left w:w="80" w:type="dxa"/>
+              <w:bottom w:w="60" w:type="dxa"/>
+              <w:right w:w="80" w:type="dxa"/>
+            </w:tcMar>
+            <w:vAlign w:val="center"/>
+          </w:tcPr>
+          <w:p>
+            <w:r>
+              <w:t xml:space="preserve">main() pievienots Thread.setDefaultUncaughtExceptionHandler: parāda paziņojumu, programma turpina darbu.</w:t>
+            </w:r>
+          </w:p>
+        </w:tc>
+        <w:tc>
+          <w:tcPr>
+            <w:tcW w:w="1100" w:type="dxa"/>
+            <w:tcBorders>
+              <w:top w:val="single" w:sz="4" w:space="0" w:color="808080"/>
+              <w:left w:val="single" w:sz="4" w:space="0" w:color="808080"/>
+              <w:bottom w:val="single" w:sz="4" w:space="0" w:color="808080"/>
+              <w:right w:val="single" w:sz="4" w:space="0" w:color="808080"/>
+            </w:tcBorders>
+            <w:tcMar>
+              <w:top w:w="60" w:type="dxa"/>
+              <w:left w:w="80" w:type="dxa"/>
+              <w:bottom w:w="60" w:type="dxa"/>
+              <w:right w:w="80" w:type="dxa"/>
+            </w:tcMar>
+            <w:vAlign w:val="center"/>
+          </w:tcPr>
+          <w:p>
+            <w:pPr>
+              <w:jc w:val="center"/>
+            </w:pPr>
+            <w:r>
+              <w:t xml:space="preserve">Novērsta</w:t>
+            </w:r>
+          </w:p>
+        </w:tc>
+      </w:tr>
+      <w:tr>
+        <w:tc>
+          <w:tcPr>
+            <w:tcW w:w="600" w:type="dxa"/>
+            <w:tcBorders>
+              <w:top w:val="single" w:sz="4" w:space="0" w:color="808080"/>
+              <w:left w:val="single" w:sz="4" w:space="0" w:color="808080"/>
+              <w:bottom w:val="single" w:sz="4" w:space="0" w:color="808080"/>
+              <w:right w:val="single" w:sz="4" w:space="0" w:color="808080"/>
+            </w:tcBorders>
+            <w:tcMar>
+              <w:top w:w="60" w:type="dxa"/>
+              <w:left w:w="80" w:type="dxa"/>
+              <w:bottom w:w="60" w:type="dxa"/>
+              <w:right w:w="80" w:type="dxa"/>
+            </w:tcMar>
+            <w:vAlign w:val="center"/>
+          </w:tcPr>
+          <w:p>
+            <w:pPr>
+              <w:jc w:val="center"/>
+            </w:pPr>
+            <w:r>
+              <w:t xml:space="preserve">14.</w:t>
+            </w:r>
+          </w:p>
+        </w:tc>
+        <w:tc>
+          <w:tcPr>
+            <w:tcW w:w="1250" w:type="dxa"/>
+            <w:tcBorders>
+              <w:top w:val="single" w:sz="4" w:space="0" w:color="808080"/>
+              <w:left w:val="single" w:sz="4" w:space="0" w:color="808080"/>
+              <w:bottom w:val="single" w:sz="4" w:space="0" w:color="808080"/>
+              <w:right w:val="single" w:sz="4" w:space="0" w:color="808080"/>
+            </w:tcBorders>
+            <w:tcMar>
+              <w:top w:w="60" w:type="dxa"/>
+              <w:left w:w="80" w:type="dxa"/>
+              <w:bottom w:w="60" w:type="dxa"/>
+              <w:right w:w="80" w:type="dxa"/>
+            </w:tcMar>
+            <w:vAlign w:val="center"/>
+          </w:tcPr>
+          <w:p>
+            <w:pPr>
+              <w:jc w:val="center"/>
+            </w:pPr>
+            <w:r>
+              <w:t xml:space="preserve">20.10.2026</w:t>
+            </w:r>
+          </w:p>
+        </w:tc>
+        <w:tc>
+          <w:tcPr>
+            <w:tcW w:w="3900" w:type="dxa"/>
+            <w:tcBorders>
+              <w:top w:val="single" w:sz="4" w:space="0" w:color="808080"/>
+              <w:left w:val="single" w:sz="4" w:space="0" w:color="808080"/>
+              <w:bottom w:val="single" w:sz="4" w:space="0" w:color="808080"/>
+              <w:right w:val="single" w:sz="4" w:space="0" w:color="808080"/>
+            </w:tcBorders>
+            <w:tcMar>
+              <w:top w:w="60" w:type="dxa"/>
+              <w:left w:w="80" w:type="dxa"/>
+              <w:bottom w:w="60" w:type="dxa"/>
+              <w:right w:w="80" w:type="dxa"/>
+            </w:tcMar>
+            <w:vAlign w:val="center"/>
+          </w:tcPr>
+          <w:p>
+            <w:r>
+              <w:t xml:space="preserve">Tabulās var iezīmēt vairākas rindas, bet pogas apstrādā tikai pirmo.</w:t>
+            </w:r>
+          </w:p>
+        </w:tc>
+        <w:tc>
+          <w:tcPr>
+            <w:tcW w:w="3300" w:type="dxa"/>
+            <w:tcBorders>
+              <w:top w:val="single" w:sz="4" w:space="0" w:color="808080"/>
+              <w:left w:val="single" w:sz="4" w:space="0" w:color="808080"/>
+              <w:bottom w:val="single" w:sz="4" w:space="0" w:color="808080"/>
+              <w:right w:val="single" w:sz="4" w:space="0" w:color="808080"/>
+            </w:tcBorders>
+            <w:tcMar>
+              <w:top w:w="60" w:type="dxa"/>
+              <w:left w:w="80" w:type="dxa"/>
+              <w:bottom w:w="60" w:type="dxa"/>
+              <w:right w:w="80" w:type="dxa"/>
+            </w:tcMar>
+            <w:vAlign w:val="center"/>
+          </w:tcPr>
+          <w:p>
+            <w:r>
+              <w:t xml:space="preserve">JTable pēc noklusējuma atļauj izvēlēties vairākas rindas.</w:t>
+            </w:r>
+          </w:p>
+        </w:tc>
+        <w:tc>
+          <w:tcPr>
+            <w:tcW w:w="3300" w:type="dxa"/>
+            <w:tcBorders>
+              <w:top w:val="single" w:sz="4" w:space="0" w:color="808080"/>
+              <w:left w:val="single" w:sz="4" w:space="0" w:color="808080"/>
+              <w:bottom w:val="single" w:sz="4" w:space="0" w:color="808080"/>
+              <w:right w:val="single" w:sz="4" w:space="0" w:color="808080"/>
+            </w:tcBorders>
+            <w:tcMar>
+              <w:top w:w="60" w:type="dxa"/>
+              <w:left w:w="80" w:type="dxa"/>
+              <w:bottom w:w="60" w:type="dxa"/>
+              <w:right w:w="80" w:type="dxa"/>
+            </w:tcMar>
+            <w:vAlign w:val="center"/>
+          </w:tcPr>
+          <w:p>
+            <w:r>
+              <w:t xml:space="preserve">Abām tabulām uzlikts ListSelectionModel.SINGLE_SELECTION.</w:t>
+            </w:r>
+          </w:p>
+        </w:tc>
+        <w:tc>
+          <w:tcPr>
+            <w:tcW w:w="1100" w:type="dxa"/>
+            <w:tcBorders>
+              <w:top w:val="single" w:sz="4" w:space="0" w:color="808080"/>
+              <w:left w:val="single" w:sz="4" w:space="0" w:color="808080"/>
+              <w:bottom w:val="single" w:sz="4" w:space="0" w:color="808080"/>
+              <w:right w:val="single" w:sz="4" w:space="0" w:color="808080"/>
+            </w:tcBorders>
+            <w:tcMar>
+              <w:top w:w="60" w:type="dxa"/>
+              <w:left w:w="80" w:type="dxa"/>
+              <w:bottom w:w="60" w:type="dxa"/>
+              <w:right w:w="80" w:type="dxa"/>
+            </w:tcMar>
+            <w:vAlign w:val="center"/>
+          </w:tcPr>
+          <w:p>
+            <w:pPr>
+              <w:jc w:val="center"/>
+            </w:pPr>
+            <w:r>
+              <w:t xml:space="preserve">Novērsta</w:t>
+            </w:r>
+          </w:p>
+        </w:tc>
+      </w:tr>
+      <w:tr>
+        <w:tc>
+          <w:tcPr>
+            <w:tcW w:w="600" w:type="dxa"/>
+            <w:tcBorders>
+              <w:top w:val="single" w:sz="4" w:space="0" w:color="808080"/>
+              <w:left w:val="single" w:sz="4" w:space="0" w:color="808080"/>
+              <w:bottom w:val="single" w:sz="4" w:space="0" w:color="808080"/>
+              <w:right w:val="single" w:sz="4" w:space="0" w:color="808080"/>
+            </w:tcBorders>
+            <w:tcMar>
+              <w:top w:w="60" w:type="dxa"/>
+              <w:left w:w="80" w:type="dxa"/>
+              <w:bottom w:w="60" w:type="dxa"/>
+              <w:right w:w="80" w:type="dxa"/>
+            </w:tcMar>
+            <w:vAlign w:val="center"/>
+          </w:tcPr>
+          <w:p>
+            <w:pPr>
+              <w:jc w:val="center"/>
+            </w:pPr>
+            <w:r>
+              <w:t xml:space="preserve">15.</w:t>
+            </w:r>
+          </w:p>
+        </w:tc>
+        <w:tc>
+          <w:tcPr>
+            <w:tcW w:w="1250" w:type="dxa"/>
+            <w:tcBorders>
+              <w:top w:val="single" w:sz="4" w:space="0" w:color="808080"/>
+              <w:left w:val="single" w:sz="4" w:space="0" w:color="808080"/>
+              <w:bottom w:val="single" w:sz="4" w:space="0" w:color="808080"/>
+              <w:right w:val="single" w:sz="4" w:space="0" w:color="808080"/>
+            </w:tcBorders>
+            <w:tcMar>
+              <w:top w:w="60" w:type="dxa"/>
+              <w:left w:w="80" w:type="dxa"/>
+              <w:bottom w:w="60" w:type="dxa"/>
+              <w:right w:w="80" w:type="dxa"/>
+            </w:tcMar>
+            <w:vAlign w:val="center"/>
+          </w:tcPr>
+          <w:p>
+            <w:pPr>
+              <w:jc w:val="center"/>
+            </w:pPr>
+            <w:r>
+              <w:t xml:space="preserve">20.10.2026</w:t>
+            </w:r>
+          </w:p>
+        </w:tc>
+        <w:tc>
+          <w:tcPr>
+            <w:tcW w:w="3900" w:type="dxa"/>
+            <w:tcBorders>
+              <w:top w:val="single" w:sz="4" w:space="0" w:color="808080"/>
+              <w:left w:val="single" w:sz="4" w:space="0" w:color="808080"/>
+              <w:bottom w:val="single" w:sz="4" w:space="0" w:color="808080"/>
+              <w:right w:val="single" w:sz="4" w:space="0" w:color="808080"/>
+            </w:tcBorders>
+            <w:tcMar>
+              <w:top w:w="60" w:type="dxa"/>
+              <w:left w:w="80" w:type="dxa"/>
+              <w:bottom w:w="60" w:type="dxa"/>
+              <w:right w:w="80" w:type="dxa"/>
+            </w:tcMar>
+            <w:vAlign w:val="center"/>
+          </w:tcPr>
+          <w:p>
+            <w:r>
+              <w:t xml:space="preserve">Var izveidot pasākumu šodienai ar jau pagājušu laiku.</w:t>
+            </w:r>
+          </w:p>
+        </w:tc>
+        <w:tc>
+          <w:tcPr>
+            <w:tcW w:w="3300" w:type="dxa"/>
+            <w:tcBorders>
+              <w:top w:val="single" w:sz="4" w:space="0" w:color="808080"/>
+              <w:left w:val="single" w:sz="4" w:space="0" w:color="808080"/>
+              <w:bottom w:val="single" w:sz="4" w:space="0" w:color="808080"/>
+              <w:right w:val="single" w:sz="4" w:space="0" w:color="808080"/>
+            </w:tcBorders>
+            <w:tcMar>
+              <w:top w:w="60" w:type="dxa"/>
+              <w:left w:w="80" w:type="dxa"/>
+              <w:bottom w:w="60" w:type="dxa"/>
+              <w:right w:w="80" w:type="dxa"/>
+            </w:tcMar>
+            <w:vAlign w:val="center"/>
+          </w:tcPr>
+          <w:p>
+            <w:r>
+              <w:t xml:space="preserve">Tika pārbaudīts tikai datums, laiks netika pārbaudīts.</w:t>
+            </w:r>
+          </w:p>
+        </w:tc>
+        <w:tc>
+          <w:tcPr>
+            <w:tcW w:w="3300" w:type="dxa"/>
+            <w:tcBorders>
+              <w:top w:val="single" w:sz="4" w:space="0" w:color="808080"/>
+              <w:left w:val="single" w:sz="4" w:space="0" w:color="808080"/>
+              <w:bottom w:val="single" w:sz="4" w:space="0" w:color="808080"/>
+              <w:right w:val="single" w:sz="4" w:space="0" w:color="808080"/>
+            </w:tcBorders>
+            <w:tcMar>
+              <w:top w:w="60" w:type="dxa"/>
+              <w:left w:w="80" w:type="dxa"/>
+              <w:bottom w:w="60" w:type="dxa"/>
+              <w:right w:w="80" w:type="dxa"/>
+            </w:tcMar>
+            <w:vAlign w:val="center"/>
+          </w:tcPr>
+          <w:p>
+            <w:r>
+              <w:t xml:space="preserve">Ja datums ir šodien, laiku salīdzina ar LocalTime.now() un parāda "Pasākuma laiks nedrīkst būt pagātnē!".</w:t>
+            </w:r>
+          </w:p>
+        </w:tc>
+        <w:tc>
+          <w:tcPr>
+            <w:tcW w:w="1100" w:type="dxa"/>
+            <w:tcBorders>
+              <w:top w:val="single" w:sz="4" w:space="0" w:color="808080"/>
+              <w:left w:val="single" w:sz="4" w:space="0" w:color="808080"/>
+              <w:bottom w:val="single" w:sz="4" w:space="0" w:color="808080"/>
+              <w:right w:val="single" w:sz="4" w:space="0" w:color="808080"/>
+            </w:tcBorders>
+            <w:tcMar>
+              <w:top w:w="60" w:type="dxa"/>
+              <w:left w:w="80" w:type="dxa"/>
+              <w:bottom w:w="60" w:type="dxa"/>
+              <w:right w:w="80" w:type="dxa"/>
+            </w:tcMar>
+            <w:vAlign w:val="center"/>
+          </w:tcPr>
+          <w:p>
+            <w:pPr>
+              <w:jc w:val="center"/>
+            </w:pPr>
+            <w:r>
+              <w:t xml:space="preserve">Novērsta</w:t>
+            </w:r>
+          </w:p>
+        </w:tc>
+      </w:tr>
+      <w:tr>
+        <w:tc>
+          <w:tcPr>
+            <w:tcW w:w="600" w:type="dxa"/>
+            <w:tcBorders>
+              <w:top w:val="single" w:sz="4" w:space="0" w:color="808080"/>
+              <w:left w:val="single" w:sz="4" w:space="0" w:color="808080"/>
+              <w:bottom w:val="single" w:sz="4" w:space="0" w:color="808080"/>
+              <w:right w:val="single" w:sz="4" w:space="0" w:color="808080"/>
+            </w:tcBorders>
+            <w:tcMar>
+              <w:top w:w="60" w:type="dxa"/>
+              <w:left w:w="80" w:type="dxa"/>
+              <w:bottom w:w="60" w:type="dxa"/>
+              <w:right w:w="80" w:type="dxa"/>
+            </w:tcMar>
+            <w:vAlign w:val="center"/>
+          </w:tcPr>
+          <w:p>
+            <w:pPr>
+              <w:jc w:val="center"/>
+            </w:pPr>
+            <w:r>
+              <w:t xml:space="preserve">16.</w:t>
+            </w:r>
+          </w:p>
+        </w:tc>
+        <w:tc>
+          <w:tcPr>
+            <w:tcW w:w="1250" w:type="dxa"/>
+            <w:tcBorders>
+              <w:top w:val="single" w:sz="4" w:space="0" w:color="808080"/>
+              <w:left w:val="single" w:sz="4" w:space="0" w:color="808080"/>
+              <w:bottom w:val="single" w:sz="4" w:space="0" w:color="808080"/>
+              <w:right w:val="single" w:sz="4" w:space="0" w:color="808080"/>
+            </w:tcBorders>
+            <w:tcMar>
+              <w:top w:w="60" w:type="dxa"/>
+              <w:left w:w="80" w:type="dxa"/>
+              <w:bottom w:w="60" w:type="dxa"/>
+              <w:right w:w="80" w:type="dxa"/>
+            </w:tcMar>
+            <w:vAlign w:val="center"/>
+          </w:tcPr>
+          <w:p>
+            <w:pPr>
+              <w:jc w:val="center"/>
+            </w:pPr>
+            <w:r>
+              <w:t xml:space="preserve">20.10.2026</w:t>
+            </w:r>
+          </w:p>
+        </w:tc>
+        <w:tc>
+          <w:tcPr>
+            <w:tcW w:w="3900" w:type="dxa"/>
+            <w:tcBorders>
+              <w:top w:val="single" w:sz="4" w:space="0" w:color="808080"/>
+              <w:left w:val="single" w:sz="4" w:space="0" w:color="808080"/>
+              <w:bottom w:val="single" w:sz="4" w:space="0" w:color="808080"/>
+              <w:right w:val="single" w:sz="4" w:space="0" w:color="808080"/>
+            </w:tcBorders>
+            <w:tcMar>
+              <w:top w:w="60" w:type="dxa"/>
+              <w:left w:w="80" w:type="dxa"/>
+              <w:bottom w:w="60" w:type="dxa"/>
+              <w:right w:w="80" w:type="dxa"/>
+            </w:tcMar>
+            <w:vAlign w:val="center"/>
+          </w:tcPr>
+          <w:p>
+            <w:r>
+              <w:t xml:space="preserve">Tālruņa laukā var ievadīt burtus un citus simbolus.</w:t>
+            </w:r>
+          </w:p>
+        </w:tc>
+        <w:tc>
+          <w:tcPr>
+            <w:tcW w:w="3300" w:type="dxa"/>
+            <w:tcBorders>
+              <w:top w:val="single" w:sz="4" w:space="0" w:color="808080"/>
+              <w:left w:val="single" w:sz="4" w:space="0" w:color="808080"/>
+              <w:bottom w:val="single" w:sz="4" w:space="0" w:color="808080"/>
+              <w:right w:val="single" w:sz="4" w:space="0" w:color="808080"/>
+            </w:tcBorders>
+            <w:tcMar>
+              <w:top w:w="60" w:type="dxa"/>
+              <w:left w:w="80" w:type="dxa"/>
+              <w:bottom w:w="60" w:type="dxa"/>
+              <w:right w:w="80" w:type="dxa"/>
+            </w:tcMar>
+            <w:vAlign w:val="center"/>
+          </w:tcPr>
+          <w:p>
+            <w:r>
+              <w:t xml:space="preserve">Tālruņa lauks netika pārbaudīts.</w:t>
+            </w:r>
+          </w:p>
+        </w:tc>
+        <w:tc>
+          <w:tcPr>
+            <w:tcW w:w="3300" w:type="dxa"/>
+            <w:tcBorders>
+              <w:top w:val="single" w:sz="4" w:space="0" w:color="808080"/>
+              <w:left w:val="single" w:sz="4" w:space="0" w:color="808080"/>
+              <w:bottom w:val="single" w:sz="4" w:space="0" w:color="808080"/>
+              <w:right w:val="single" w:sz="4" w:space="0" w:color="808080"/>
+            </w:tcBorders>
+            <w:tcMar>
+              <w:top w:w="60" w:type="dxa"/>
+              <w:left w:w="80" w:type="dxa"/>
+              <w:bottom w:w="60" w:type="dxa"/>
+              <w:right w:w="80" w:type="dxa"/>
+            </w:tcMar>
+            <w:vAlign w:val="center"/>
+          </w:tcPr>
+          <w:p>
+            <w:r>
+              <w:t xml:space="preserve">Ja tālrunis ievadīts, to pārbauda ar regulāro izteiksmi (tikai cipari, + un atstarpes).</w:t>
+            </w:r>
+          </w:p>
+        </w:tc>
+        <w:tc>
+          <w:tcPr>
+            <w:tcW w:w="1100" w:type="dxa"/>
+            <w:tcBorders>
+              <w:top w:val="single" w:sz="4" w:space="0" w:color="808080"/>
+              <w:left w:val="single" w:sz="4" w:space="0" w:color="808080"/>
+              <w:bottom w:val="single" w:sz="4" w:space="0" w:color="808080"/>
+              <w:right w:val="single" w:sz="4" w:space="0" w:color="808080"/>
+            </w:tcBorders>
+            <w:tcMar>
+              <w:top w:w="60" w:type="dxa"/>
+              <w:left w:w="80" w:type="dxa"/>
+              <w:bottom w:w="60" w:type="dxa"/>
+              <w:right w:w="80" w:type="dxa"/>
+            </w:tcMar>
+            <w:vAlign w:val="center"/>
+          </w:tcPr>
+          <w:p>
+            <w:pPr>
+              <w:jc w:val="center"/>
+            </w:pPr>
+            <w:r>
+              <w:t xml:space="preserve">Novērsta</w:t>
             </w:r>
           </w:p>
         </w:tc>

</xml_diff>

<commit_message>
Pievienota pasākumu meklēšana pēc vairākiem kritērijiem, atjaunots kļūdu žurnāls
</commit_message>
<xml_diff>
--- a/Kludu_zurnals.docx
+++ b/Kludu_zurnals.docx
@@ -56,12 +56,12 @@
         <w:tblLook w:val="04A0" w:firstRow="1" w:lastRow="0" w:firstColumn="1" w:lastColumn="0" w:noHBand="0" w:noVBand="1"/>
       </w:tblPr>
       <w:tblGrid>
-        <w:gridCol w:w="555"/>
-        <w:gridCol w:w="1196"/>
-        <w:gridCol w:w="3822"/>
-        <w:gridCol w:w="2835"/>
+        <w:gridCol w:w="548"/>
+        <w:gridCol w:w="1186"/>
+        <w:gridCol w:w="3809"/>
+        <w:gridCol w:w="2876"/>
         <w:gridCol w:w="4004"/>
-        <w:gridCol w:w="1038"/>
+        <w:gridCol w:w="1027"/>
       </w:tblGrid>
       <w:tr>
         <w:trPr>
@@ -1768,7 +1768,7 @@
               <w:jc w:val="center"/>
             </w:pPr>
             <w:r>
-              <w:t xml:space="preserve">11.</w:t>
+              <w:t>11.</w:t>
             </w:r>
           </w:p>
         </w:tc>
@@ -1794,7 +1794,7 @@
               <w:jc w:val="center"/>
             </w:pPr>
             <w:r>
-              <w:t xml:space="preserve">12.10.2026</w:t>
+              <w:t>12.10.2026</w:t>
             </w:r>
           </w:p>
         </w:tc>
@@ -1817,7 +1817,7 @@
           </w:tcPr>
           <w:p>
             <w:r>
-              <w:t xml:space="preserve">Atkārtots pieteikums tam pašam pasākumam izraisa kļūdu 23505.</w:t>
+              <w:t>Atkārtots pieteikums tam pašam pasākumam izraisa kļūdu 23505.</w:t>
             </w:r>
           </w:p>
         </w:tc>
@@ -1840,7 +1840,7 @@
           </w:tcPr>
           <w:p>
             <w:r>
-              <w:t xml:space="preserve">Tabulā REGISTRACIJAS ir UNIQUE (pasakuma_id, lietotaja_id).</w:t>
+              <w:t>Tabulā REGISTRACIJAS ir UNIQUE (pasakuma_id, lietotaja_id).</w:t>
             </w:r>
           </w:p>
         </w:tc>
@@ -1863,7 +1863,7 @@
           </w:tcPr>
           <w:p>
             <w:r>
-              <w:t xml:space="preserve">Poga "Reģistrēties dalībai" pievienota. Pirms saglabāšanas jauPieteicies() pārbauda, vai lietotājs jau ir pieteicies, un parāda "Jūs jau esat pieteicies šim pasākumam!".</w:t>
+              <w:t>Poga "Reģistrēties dalībai" pievienota. Pirms saglabāšanas jauPieteicies() pārbauda, vai lietotājs jau ir pieteicies, un parāda "Jūs jau esat pieteicies šim pasākumam!".</w:t>
             </w:r>
           </w:p>
         </w:tc>
@@ -1889,7 +1889,7 @@
               <w:jc w:val="center"/>
             </w:pPr>
             <w:r>
-              <w:t xml:space="preserve">Novērsta</w:t>
+              <w:t>Novērsta</w:t>
             </w:r>
           </w:p>
         </w:tc>
@@ -1917,7 +1917,7 @@
               <w:jc w:val="center"/>
             </w:pPr>
             <w:r>
-              <w:t xml:space="preserve">12.</w:t>
+              <w:t>12.</w:t>
             </w:r>
           </w:p>
         </w:tc>
@@ -1943,7 +1943,7 @@
               <w:jc w:val="center"/>
             </w:pPr>
             <w:r>
-              <w:t xml:space="preserve">20.10.2026</w:t>
+              <w:t>20.10.2026</w:t>
             </w:r>
           </w:p>
         </w:tc>
@@ -1966,7 +1966,7 @@
           </w:tcPr>
           <w:p>
             <w:r>
-              <w:t xml:space="preserve">Ja datu bāze nav pieslēgta, ielogojoties rāda "Nepareizs lietotājvārds vai parole!".</w:t>
+              <w:t>Ja datu bāze nav pieslēgta, ielogojoties rāda "Nepareizs lietotājvārds vai parole!".</w:t>
             </w:r>
           </w:p>
         </w:tc>
@@ -1989,7 +1989,7 @@
           </w:tcPr>
           <w:p>
             <w:r>
-              <w:t xml:space="preserve">atrastLietotaju() atgriež null gan tad, ja lietotāja nav, gan tad, ja nav savienojuma ar datu bāzi.</w:t>
+              <w:t>atrastLietotaju() atgriež null gan tad, ja lietotāja nav, gan tad, ja nav savienojuma ar datu bāzi.</w:t>
             </w:r>
           </w:p>
         </w:tc>
@@ -2012,7 +2012,7 @@
           </w:tcPr>
           <w:p>
             <w:r>
-              <w:t xml:space="preserve">GUI atceras, vai pieslēgšanās izdevās (dbPieejama). Ielogojoties un reģistrējoties parāda "Nav savienojuma ar datu bāzi".</w:t>
+              <w:t>GUI atceras, vai pieslēgšanās izdevās (dbPieejama). Ielogojoties un reģistrējoties parāda "Nav savienojuma ar datu bāzi".</w:t>
             </w:r>
           </w:p>
         </w:tc>
@@ -2038,7 +2038,7 @@
               <w:jc w:val="center"/>
             </w:pPr>
             <w:r>
-              <w:t xml:space="preserve">Novērsta</w:t>
+              <w:t>Novērsta</w:t>
             </w:r>
           </w:p>
         </w:tc>
@@ -2066,7 +2066,7 @@
               <w:jc w:val="center"/>
             </w:pPr>
             <w:r>
-              <w:t xml:space="preserve">13.</w:t>
+              <w:t>13.</w:t>
             </w:r>
           </w:p>
         </w:tc>
@@ -2092,7 +2092,7 @@
               <w:jc w:val="center"/>
             </w:pPr>
             <w:r>
-              <w:t xml:space="preserve">20.10.2026</w:t>
+              <w:t>20.10.2026</w:t>
             </w:r>
           </w:p>
         </w:tc>
@@ -2115,7 +2115,7 @@
           </w:tcPr>
           <w:p>
             <w:r>
-              <w:t xml:space="preserve">Neparedzētas kļūdas gadījumā lietotājs neko neredz, kļūda parādās tikai konsolē.</w:t>
+              <w:t>Neparedzētas kļūdas gadījumā lietotājs neko neredz, kļūda parādās tikai konsolē.</w:t>
             </w:r>
           </w:p>
         </w:tc>
@@ -2138,7 +2138,7 @@
           </w:tcPr>
           <w:p>
             <w:r>
-              <w:t xml:space="preserve">Programmā nebija kļūdu apstrādes augstākajā līmenī.</w:t>
+              <w:t>Programmā nebija kļūdu apstrādes augstākajā līmenī.</w:t>
             </w:r>
           </w:p>
         </w:tc>
@@ -2161,7 +2161,7 @@
           </w:tcPr>
           <w:p>
             <w:r>
-              <w:t xml:space="preserve">main() pievienots Thread.setDefaultUncaughtExceptionHandler: parāda paziņojumu, programma turpina darbu.</w:t>
+              <w:t>main() pievienots Thread.setDefaultUncaughtExceptionHandler: parāda paziņojumu, programma turpina darbu.</w:t>
             </w:r>
           </w:p>
         </w:tc>
@@ -2187,7 +2187,7 @@
               <w:jc w:val="center"/>
             </w:pPr>
             <w:r>
-              <w:t xml:space="preserve">Novērsta</w:t>
+              <w:t>Novērsta</w:t>
             </w:r>
           </w:p>
         </w:tc>
@@ -2215,7 +2215,7 @@
               <w:jc w:val="center"/>
             </w:pPr>
             <w:r>
-              <w:t xml:space="preserve">14.</w:t>
+              <w:t>14.</w:t>
             </w:r>
           </w:p>
         </w:tc>
@@ -2241,7 +2241,7 @@
               <w:jc w:val="center"/>
             </w:pPr>
             <w:r>
-              <w:t xml:space="preserve">20.10.2026</w:t>
+              <w:t>20.10.2026</w:t>
             </w:r>
           </w:p>
         </w:tc>
@@ -2264,7 +2264,7 @@
           </w:tcPr>
           <w:p>
             <w:r>
-              <w:t xml:space="preserve">Tabulās var iezīmēt vairākas rindas, bet pogas apstrādā tikai pirmo.</w:t>
+              <w:t>Tabulās var iezīmēt vairākas rindas, bet pogas apstrādā tikai pirmo.</w:t>
             </w:r>
           </w:p>
         </w:tc>
@@ -2287,7 +2287,7 @@
           </w:tcPr>
           <w:p>
             <w:r>
-              <w:t xml:space="preserve">JTable pēc noklusējuma atļauj izvēlēties vairākas rindas.</w:t>
+              <w:t>JTable pēc noklusējuma atļauj izvēlēties vairākas rindas.</w:t>
             </w:r>
           </w:p>
         </w:tc>
@@ -2310,7 +2310,7 @@
           </w:tcPr>
           <w:p>
             <w:r>
-              <w:t xml:space="preserve">Abām tabulām uzlikts ListSelectionModel.SINGLE_SELECTION.</w:t>
+              <w:t>Abām tabulām uzlikts ListSelectionModel.SINGLE_SELECTION.</w:t>
             </w:r>
           </w:p>
         </w:tc>
@@ -2336,7 +2336,7 @@
               <w:jc w:val="center"/>
             </w:pPr>
             <w:r>
-              <w:t xml:space="preserve">Novērsta</w:t>
+              <w:t>Novērsta</w:t>
             </w:r>
           </w:p>
         </w:tc>
@@ -2364,7 +2364,7 @@
               <w:jc w:val="center"/>
             </w:pPr>
             <w:r>
-              <w:t xml:space="preserve">15.</w:t>
+              <w:t>15.</w:t>
             </w:r>
           </w:p>
         </w:tc>
@@ -2390,7 +2390,7 @@
               <w:jc w:val="center"/>
             </w:pPr>
             <w:r>
-              <w:t xml:space="preserve">20.10.2026</w:t>
+              <w:t>20.10.2026</w:t>
             </w:r>
           </w:p>
         </w:tc>
@@ -2413,7 +2413,7 @@
           </w:tcPr>
           <w:p>
             <w:r>
-              <w:t xml:space="preserve">Var izveidot pasākumu šodienai ar jau pagājušu laiku.</w:t>
+              <w:t>Var izveidot pasākumu šodienai ar jau pagājušu laiku.</w:t>
             </w:r>
           </w:p>
         </w:tc>
@@ -2436,7 +2436,7 @@
           </w:tcPr>
           <w:p>
             <w:r>
-              <w:t xml:space="preserve">Tika pārbaudīts tikai datums, laiks netika pārbaudīts.</w:t>
+              <w:t>Tika pārbaudīts tikai datums, laiks netika pārbaudīts.</w:t>
             </w:r>
           </w:p>
         </w:tc>
@@ -2459,7 +2459,7 @@
           </w:tcPr>
           <w:p>
             <w:r>
-              <w:t xml:space="preserve">Ja datums ir šodien, laiku salīdzina ar LocalTime.now() un parāda "Pasākuma laiks nedrīkst būt pagātnē!".</w:t>
+              <w:t>Ja datums ir šodien, laiku salīdzina ar LocalTime.now() un parāda "Pasākuma laiks nedrīkst būt pagātnē!".</w:t>
             </w:r>
           </w:p>
         </w:tc>
@@ -2485,7 +2485,7 @@
               <w:jc w:val="center"/>
             </w:pPr>
             <w:r>
-              <w:t xml:space="preserve">Novērsta</w:t>
+              <w:t>Novērsta</w:t>
             </w:r>
           </w:p>
         </w:tc>
@@ -2513,7 +2513,7 @@
               <w:jc w:val="center"/>
             </w:pPr>
             <w:r>
-              <w:t xml:space="preserve">16.</w:t>
+              <w:t>16.</w:t>
             </w:r>
           </w:p>
         </w:tc>
@@ -2539,7 +2539,7 @@
               <w:jc w:val="center"/>
             </w:pPr>
             <w:r>
-              <w:t xml:space="preserve">20.10.2026</w:t>
+              <w:t>20.10.2026</w:t>
             </w:r>
           </w:p>
         </w:tc>
@@ -2562,7 +2562,7 @@
           </w:tcPr>
           <w:p>
             <w:r>
-              <w:t xml:space="preserve">Tālruņa laukā var ievadīt burtus un citus simbolus.</w:t>
+              <w:t>Tālruņa laukā var ievadīt burtus un citus simbolus.</w:t>
             </w:r>
           </w:p>
         </w:tc>
@@ -2585,7 +2585,7 @@
           </w:tcPr>
           <w:p>
             <w:r>
-              <w:t xml:space="preserve">Tālruņa lauks netika pārbaudīts.</w:t>
+              <w:t>Tālruņa lauks netika pārbaudīts.</w:t>
             </w:r>
           </w:p>
         </w:tc>
@@ -2608,7 +2608,7 @@
           </w:tcPr>
           <w:p>
             <w:r>
-              <w:t xml:space="preserve">Ja tālrunis ievadīts, to pārbauda ar regulāro izteiksmi (tikai cipari, + un atstarpes).</w:t>
+              <w:t>Ja tālrunis ievadīts, to pārbauda ar regulāro izteiksmi (tikai cipari, + un atstarpes).</w:t>
             </w:r>
           </w:p>
         </w:tc>
@@ -2634,7 +2634,305 @@
               <w:jc w:val="center"/>
             </w:pPr>
             <w:r>
-              <w:t xml:space="preserve">Novērsta</w:t>
+              <w:t>Novērsta</w:t>
+            </w:r>
+          </w:p>
+        </w:tc>
+      </w:tr>
+      <w:tr>
+        <w:tc>
+          <w:tcPr>
+            <w:tcW w:w="600" w:type="dxa"/>
+            <w:tcBorders>
+              <w:top w:val="single" w:sz="4" w:space="0" w:color="808080"/>
+              <w:left w:val="single" w:sz="4" w:space="0" w:color="808080"/>
+              <w:bottom w:val="single" w:sz="4" w:space="0" w:color="808080"/>
+              <w:right w:val="single" w:sz="4" w:space="0" w:color="808080"/>
+            </w:tcBorders>
+            <w:tcMar>
+              <w:top w:w="60" w:type="dxa"/>
+              <w:left w:w="80" w:type="dxa"/>
+              <w:bottom w:w="60" w:type="dxa"/>
+              <w:right w:w="80" w:type="dxa"/>
+            </w:tcMar>
+            <w:vAlign w:val="center"/>
+          </w:tcPr>
+          <w:p>
+            <w:pPr>
+              <w:jc w:val="center"/>
+            </w:pPr>
+            <w:r>
+              <w:t>17.</w:t>
+            </w:r>
+          </w:p>
+        </w:tc>
+        <w:tc>
+          <w:tcPr>
+            <w:tcW w:w="1250" w:type="dxa"/>
+            <w:tcBorders>
+              <w:top w:val="single" w:sz="4" w:space="0" w:color="808080"/>
+              <w:left w:val="single" w:sz="4" w:space="0" w:color="808080"/>
+              <w:bottom w:val="single" w:sz="4" w:space="0" w:color="808080"/>
+              <w:right w:val="single" w:sz="4" w:space="0" w:color="808080"/>
+            </w:tcBorders>
+            <w:tcMar>
+              <w:top w:w="60" w:type="dxa"/>
+              <w:left w:w="80" w:type="dxa"/>
+              <w:bottom w:w="60" w:type="dxa"/>
+              <w:right w:w="80" w:type="dxa"/>
+            </w:tcMar>
+            <w:vAlign w:val="center"/>
+          </w:tcPr>
+          <w:p>
+            <w:pPr>
+              <w:jc w:val="center"/>
+            </w:pPr>
+            <w:r>
+              <w:t>21.10.2026</w:t>
+            </w:r>
+          </w:p>
+        </w:tc>
+        <w:tc>
+          <w:tcPr>
+            <w:tcW w:w="3900" w:type="dxa"/>
+            <w:tcBorders>
+              <w:top w:val="single" w:sz="4" w:space="0" w:color="808080"/>
+              <w:left w:val="single" w:sz="4" w:space="0" w:color="808080"/>
+              <w:bottom w:val="single" w:sz="4" w:space="0" w:color="808080"/>
+              <w:right w:val="single" w:sz="4" w:space="0" w:color="808080"/>
+            </w:tcBorders>
+            <w:tcMar>
+              <w:top w:w="60" w:type="dxa"/>
+              <w:left w:w="80" w:type="dxa"/>
+              <w:bottom w:w="60" w:type="dxa"/>
+              <w:right w:w="80" w:type="dxa"/>
+            </w:tcMar>
+            <w:vAlign w:val="center"/>
+          </w:tcPr>
+          <w:p>
+            <w:r>
+              <w:t>Meklējot pasākumu pēc vietas ar mazajiem burtiem (piem. "rīga"), netiek atrasts pasākums "RĪGA".</w:t>
+            </w:r>
+          </w:p>
+        </w:tc>
+        <w:tc>
+          <w:tcPr>
+            <w:tcW w:w="3300" w:type="dxa"/>
+            <w:tcBorders>
+              <w:top w:val="single" w:sz="4" w:space="0" w:color="808080"/>
+              <w:left w:val="single" w:sz="4" w:space="0" w:color="808080"/>
+              <w:bottom w:val="single" w:sz="4" w:space="0" w:color="808080"/>
+              <w:right w:val="single" w:sz="4" w:space="0" w:color="808080"/>
+            </w:tcBorders>
+            <w:tcMar>
+              <w:top w:w="60" w:type="dxa"/>
+              <w:left w:w="80" w:type="dxa"/>
+              <w:bottom w:w="60" w:type="dxa"/>
+              <w:right w:w="80" w:type="dxa"/>
+            </w:tcMar>
+            <w:vAlign w:val="center"/>
+          </w:tcPr>
+          <w:p>
+            <w:r>
+              <w:t>Karodziņš (?i) regulārajā izteiksmē nesalīdzina lielos un mazos burtus ar garumzīmēm un mīkstinājuma zīmēm (ī, Ī, ļ, Ļ u.c.).</w:t>
+            </w:r>
+          </w:p>
+        </w:tc>
+        <w:tc>
+          <w:tcPr>
+            <w:tcW w:w="3300" w:type="dxa"/>
+            <w:tcBorders>
+              <w:top w:val="single" w:sz="4" w:space="0" w:color="808080"/>
+              <w:left w:val="single" w:sz="4" w:space="0" w:color="808080"/>
+              <w:bottom w:val="single" w:sz="4" w:space="0" w:color="808080"/>
+              <w:right w:val="single" w:sz="4" w:space="0" w:color="808080"/>
+            </w:tcBorders>
+            <w:tcMar>
+              <w:top w:w="60" w:type="dxa"/>
+              <w:left w:w="80" w:type="dxa"/>
+              <w:bottom w:w="60" w:type="dxa"/>
+              <w:right w:w="80" w:type="dxa"/>
+            </w:tcMar>
+            <w:vAlign w:val="center"/>
+          </w:tcPr>
+          <w:p>
+            <w:r>
+              <w:t>Meklēšanas filtram pievienots karodziņš (?iu), lai lielos un mazos burtus salīdzinātu arī latviešu burtiem.</w:t>
+            </w:r>
+          </w:p>
+        </w:tc>
+        <w:tc>
+          <w:tcPr>
+            <w:tcW w:w="1100" w:type="dxa"/>
+            <w:tcBorders>
+              <w:top w:val="single" w:sz="4" w:space="0" w:color="808080"/>
+              <w:left w:val="single" w:sz="4" w:space="0" w:color="808080"/>
+              <w:bottom w:val="single" w:sz="4" w:space="0" w:color="808080"/>
+              <w:right w:val="single" w:sz="4" w:space="0" w:color="808080"/>
+            </w:tcBorders>
+            <w:tcMar>
+              <w:top w:w="60" w:type="dxa"/>
+              <w:left w:w="80" w:type="dxa"/>
+              <w:bottom w:w="60" w:type="dxa"/>
+              <w:right w:w="80" w:type="dxa"/>
+            </w:tcMar>
+            <w:vAlign w:val="center"/>
+          </w:tcPr>
+          <w:p>
+            <w:pPr>
+              <w:jc w:val="center"/>
+            </w:pPr>
+            <w:r>
+              <w:t>Novērsta</w:t>
+            </w:r>
+          </w:p>
+        </w:tc>
+      </w:tr>
+      <w:tr>
+        <w:tc>
+          <w:tcPr>
+            <w:tcW w:w="600" w:type="dxa"/>
+            <w:tcBorders>
+              <w:top w:val="single" w:sz="4" w:space="0" w:color="808080"/>
+              <w:left w:val="single" w:sz="4" w:space="0" w:color="808080"/>
+              <w:bottom w:val="single" w:sz="4" w:space="0" w:color="808080"/>
+              <w:right w:val="single" w:sz="4" w:space="0" w:color="808080"/>
+            </w:tcBorders>
+            <w:tcMar>
+              <w:top w:w="60" w:type="dxa"/>
+              <w:left w:w="80" w:type="dxa"/>
+              <w:bottom w:w="60" w:type="dxa"/>
+              <w:right w:w="80" w:type="dxa"/>
+            </w:tcMar>
+            <w:vAlign w:val="center"/>
+          </w:tcPr>
+          <w:p>
+            <w:pPr>
+              <w:jc w:val="center"/>
+            </w:pPr>
+            <w:r>
+              <w:t>18.</w:t>
+            </w:r>
+          </w:p>
+        </w:tc>
+        <w:tc>
+          <w:tcPr>
+            <w:tcW w:w="1250" w:type="dxa"/>
+            <w:tcBorders>
+              <w:top w:val="single" w:sz="4" w:space="0" w:color="808080"/>
+              <w:left w:val="single" w:sz="4" w:space="0" w:color="808080"/>
+              <w:bottom w:val="single" w:sz="4" w:space="0" w:color="808080"/>
+              <w:right w:val="single" w:sz="4" w:space="0" w:color="808080"/>
+            </w:tcBorders>
+            <w:tcMar>
+              <w:top w:w="60" w:type="dxa"/>
+              <w:left w:w="80" w:type="dxa"/>
+              <w:bottom w:w="60" w:type="dxa"/>
+              <w:right w:w="80" w:type="dxa"/>
+            </w:tcMar>
+            <w:vAlign w:val="center"/>
+          </w:tcPr>
+          <w:p>
+            <w:pPr>
+              <w:jc w:val="center"/>
+            </w:pPr>
+            <w:r>
+              <w:t>21.10.2026</w:t>
+            </w:r>
+          </w:p>
+        </w:tc>
+        <w:tc>
+          <w:tcPr>
+            <w:tcW w:w="3900" w:type="dxa"/>
+            <w:tcBorders>
+              <w:top w:val="single" w:sz="4" w:space="0" w:color="808080"/>
+              <w:left w:val="single" w:sz="4" w:space="0" w:color="808080"/>
+              <w:bottom w:val="single" w:sz="4" w:space="0" w:color="808080"/>
+              <w:right w:val="single" w:sz="4" w:space="0" w:color="808080"/>
+            </w:tcBorders>
+            <w:tcMar>
+              <w:top w:w="60" w:type="dxa"/>
+              <w:left w:w="80" w:type="dxa"/>
+              <w:bottom w:w="60" w:type="dxa"/>
+              <w:right w:w="80" w:type="dxa"/>
+            </w:tcMar>
+            <w:vAlign w:val="center"/>
+          </w:tcPr>
+          <w:p>
+            <w:r>
+              <w:t>Meklēšanas laukā ievadot simbolus, piem. "(" vai "+", rodas PatternSyntaxException vai tiek atrasti nepareizi pasākumi.</w:t>
+            </w:r>
+          </w:p>
+        </w:tc>
+        <w:tc>
+          <w:tcPr>
+            <w:tcW w:w="3300" w:type="dxa"/>
+            <w:tcBorders>
+              <w:top w:val="single" w:sz="4" w:space="0" w:color="808080"/>
+              <w:left w:val="single" w:sz="4" w:space="0" w:color="808080"/>
+              <w:bottom w:val="single" w:sz="4" w:space="0" w:color="808080"/>
+              <w:right w:val="single" w:sz="4" w:space="0" w:color="808080"/>
+            </w:tcBorders>
+            <w:tcMar>
+              <w:top w:w="60" w:type="dxa"/>
+              <w:left w:w="80" w:type="dxa"/>
+              <w:bottom w:w="60" w:type="dxa"/>
+              <w:right w:w="80" w:type="dxa"/>
+            </w:tcMar>
+            <w:vAlign w:val="center"/>
+          </w:tcPr>
+          <w:p>
+            <w:r>
+              <w:t>RowFilter.regexFilter() ievadīto tekstu uztver kā regulāro izteiksmi, kurā simboliem ( ) . + * ir īpaša nozīme.</w:t>
+            </w:r>
+          </w:p>
+        </w:tc>
+        <w:tc>
+          <w:tcPr>
+            <w:tcW w:w="3300" w:type="dxa"/>
+            <w:tcBorders>
+              <w:top w:val="single" w:sz="4" w:space="0" w:color="808080"/>
+              <w:left w:val="single" w:sz="4" w:space="0" w:color="808080"/>
+              <w:bottom w:val="single" w:sz="4" w:space="0" w:color="808080"/>
+              <w:right w:val="single" w:sz="4" w:space="0" w:color="808080"/>
+            </w:tcBorders>
+            <w:tcMar>
+              <w:top w:w="60" w:type="dxa"/>
+              <w:left w:w="80" w:type="dxa"/>
+              <w:bottom w:w="60" w:type="dxa"/>
+              <w:right w:w="80" w:type="dxa"/>
+            </w:tcMar>
+            <w:vAlign w:val="center"/>
+          </w:tcPr>
+          <w:p>
+            <w:r>
+              <w:t>Ievadītais teksts tiek apstrādāts ar Pattern.quote(), tāpēc to meklē burtiski.</w:t>
+            </w:r>
+          </w:p>
+        </w:tc>
+        <w:tc>
+          <w:tcPr>
+            <w:tcW w:w="1100" w:type="dxa"/>
+            <w:tcBorders>
+              <w:top w:val="single" w:sz="4" w:space="0" w:color="808080"/>
+              <w:left w:val="single" w:sz="4" w:space="0" w:color="808080"/>
+              <w:bottom w:val="single" w:sz="4" w:space="0" w:color="808080"/>
+              <w:right w:val="single" w:sz="4" w:space="0" w:color="808080"/>
+            </w:tcBorders>
+            <w:tcMar>
+              <w:top w:w="60" w:type="dxa"/>
+              <w:left w:w="80" w:type="dxa"/>
+              <w:bottom w:w="60" w:type="dxa"/>
+              <w:right w:w="80" w:type="dxa"/>
+            </w:tcMar>
+            <w:vAlign w:val="center"/>
+          </w:tcPr>
+          <w:p>
+            <w:pPr>
+              <w:jc w:val="center"/>
+            </w:pPr>
+            <w:r>
+              <w:t>Novērsta</w:t>
             </w:r>
           </w:p>
         </w:tc>

</xml_diff>

<commit_message>
Pievienota galvenā izvēlne, atjaunots kļūdu žurnāls.
</commit_message>
<xml_diff>
--- a/Kludu_zurnals.docx
+++ b/Kludu_zurnals.docx
@@ -56,12 +56,12 @@
         <w:tblLook w:val="04A0" w:firstRow="1" w:lastRow="0" w:firstColumn="1" w:lastColumn="0" w:noHBand="0" w:noVBand="1"/>
       </w:tblPr>
       <w:tblGrid>
-        <w:gridCol w:w="548"/>
-        <w:gridCol w:w="1186"/>
-        <w:gridCol w:w="3809"/>
-        <w:gridCol w:w="2876"/>
+        <w:gridCol w:w="529"/>
+        <w:gridCol w:w="1164"/>
+        <w:gridCol w:w="3777"/>
+        <w:gridCol w:w="2974"/>
         <w:gridCol w:w="4004"/>
-        <w:gridCol w:w="1027"/>
+        <w:gridCol w:w="1002"/>
       </w:tblGrid>
       <w:tr>
         <w:trPr>
@@ -2907,6 +2907,309 @@
           <w:p>
             <w:r>
               <w:t>Ievadītais teksts tiek apstrādāts ar Pattern.quote(), tāpēc to meklē burtiski.</w:t>
+            </w:r>
+          </w:p>
+        </w:tc>
+        <w:tc>
+          <w:tcPr>
+            <w:tcW w:w="1100" w:type="dxa"/>
+            <w:tcBorders>
+              <w:top w:val="single" w:sz="4" w:space="0" w:color="808080"/>
+              <w:left w:val="single" w:sz="4" w:space="0" w:color="808080"/>
+              <w:bottom w:val="single" w:sz="4" w:space="0" w:color="808080"/>
+              <w:right w:val="single" w:sz="4" w:space="0" w:color="808080"/>
+            </w:tcBorders>
+            <w:tcMar>
+              <w:top w:w="60" w:type="dxa"/>
+              <w:left w:w="80" w:type="dxa"/>
+              <w:bottom w:w="60" w:type="dxa"/>
+              <w:right w:w="80" w:type="dxa"/>
+            </w:tcMar>
+            <w:vAlign w:val="center"/>
+          </w:tcPr>
+          <w:p>
+            <w:pPr>
+              <w:jc w:val="center"/>
+            </w:pPr>
+            <w:r>
+              <w:t>Novērsta</w:t>
+            </w:r>
+          </w:p>
+        </w:tc>
+      </w:tr>
+      <w:tr>
+        <w:tc>
+          <w:tcPr>
+            <w:tcW w:w="600" w:type="dxa"/>
+            <w:tcBorders>
+              <w:top w:val="single" w:sz="4" w:space="0" w:color="808080"/>
+              <w:left w:val="single" w:sz="4" w:space="0" w:color="808080"/>
+              <w:bottom w:val="single" w:sz="4" w:space="0" w:color="808080"/>
+              <w:right w:val="single" w:sz="4" w:space="0" w:color="808080"/>
+            </w:tcBorders>
+            <w:tcMar>
+              <w:top w:w="60" w:type="dxa"/>
+              <w:left w:w="80" w:type="dxa"/>
+              <w:bottom w:w="60" w:type="dxa"/>
+              <w:right w:w="80" w:type="dxa"/>
+            </w:tcMar>
+            <w:vAlign w:val="center"/>
+          </w:tcPr>
+          <w:p>
+            <w:pPr>
+              <w:jc w:val="center"/>
+            </w:pPr>
+            <w:r>
+              <w:t>19.</w:t>
+            </w:r>
+          </w:p>
+        </w:tc>
+        <w:tc>
+          <w:tcPr>
+            <w:tcW w:w="1250" w:type="dxa"/>
+            <w:tcBorders>
+              <w:top w:val="single" w:sz="4" w:space="0" w:color="808080"/>
+              <w:left w:val="single" w:sz="4" w:space="0" w:color="808080"/>
+              <w:bottom w:val="single" w:sz="4" w:space="0" w:color="808080"/>
+              <w:right w:val="single" w:sz="4" w:space="0" w:color="808080"/>
+            </w:tcBorders>
+            <w:tcMar>
+              <w:top w:w="60" w:type="dxa"/>
+              <w:left w:w="80" w:type="dxa"/>
+              <w:bottom w:w="60" w:type="dxa"/>
+              <w:right w:w="80" w:type="dxa"/>
+            </w:tcMar>
+            <w:vAlign w:val="center"/>
+          </w:tcPr>
+          <w:p>
+            <w:pPr>
+              <w:jc w:val="center"/>
+            </w:pPr>
+            <w:r>
+              <w:t>22.10.2026</w:t>
+            </w:r>
+          </w:p>
+        </w:tc>
+        <w:tc>
+          <w:tcPr>
+            <w:tcW w:w="3900" w:type="dxa"/>
+            <w:tcBorders>
+              <w:top w:val="single" w:sz="4" w:space="0" w:color="808080"/>
+              <w:left w:val="single" w:sz="4" w:space="0" w:color="808080"/>
+              <w:bottom w:val="single" w:sz="4" w:space="0" w:color="808080"/>
+              <w:right w:val="single" w:sz="4" w:space="0" w:color="808080"/>
+            </w:tcBorders>
+            <w:tcMar>
+              <w:top w:w="60" w:type="dxa"/>
+              <w:left w:w="80" w:type="dxa"/>
+              <w:bottom w:w="60" w:type="dxa"/>
+              <w:right w:w="80" w:type="dxa"/>
+            </w:tcMar>
+            <w:vAlign w:val="center"/>
+          </w:tcPr>
+          <w:p>
+            <w:r>
+              <w:t>Galvenajam logam nav galvenās izvēlnes, lai gan uzdevumā tā ir obligāta (skolotājas piezīme).</w:t>
+            </w:r>
+          </w:p>
+        </w:tc>
+        <w:tc>
+          <w:tcPr>
+            <w:tcW w:w="3300" w:type="dxa"/>
+            <w:tcBorders>
+              <w:top w:val="single" w:sz="4" w:space="0" w:color="808080"/>
+              <w:left w:val="single" w:sz="4" w:space="0" w:color="808080"/>
+              <w:bottom w:val="single" w:sz="4" w:space="0" w:color="808080"/>
+              <w:right w:val="single" w:sz="4" w:space="0" w:color="808080"/>
+            </w:tcBorders>
+            <w:tcMar>
+              <w:top w:w="60" w:type="dxa"/>
+              <w:left w:w="80" w:type="dxa"/>
+              <w:bottom w:w="60" w:type="dxa"/>
+              <w:right w:w="80" w:type="dxa"/>
+            </w:tcMar>
+            <w:vAlign w:val="center"/>
+          </w:tcPr>
+          <w:p>
+            <w:r>
+              <w:t>Galvenajā logā (JFrame) bija tikai darbības pogas, JMenuBar netika izveidots.</w:t>
+            </w:r>
+          </w:p>
+        </w:tc>
+        <w:tc>
+          <w:tcPr>
+            <w:tcW w:w="3300" w:type="dxa"/>
+            <w:tcBorders>
+              <w:top w:val="single" w:sz="4" w:space="0" w:color="808080"/>
+              <w:left w:val="single" w:sz="4" w:space="0" w:color="808080"/>
+              <w:bottom w:val="single" w:sz="4" w:space="0" w:color="808080"/>
+              <w:right w:val="single" w:sz="4" w:space="0" w:color="808080"/>
+            </w:tcBorders>
+            <w:tcMar>
+              <w:top w:w="60" w:type="dxa"/>
+              <w:left w:w="80" w:type="dxa"/>
+              <w:bottom w:w="60" w:type="dxa"/>
+              <w:right w:w="80" w:type="dxa"/>
+            </w:tcMar>
+            <w:vAlign w:val="center"/>
+          </w:tcPr>
+          <w:p>
+            <w:r>
+              <w:t xml:space="preserve">Ar GUI Builder pievienota izvēlne "Fails" (Izrakstīties, Iziet) un "Pasākumi" (Reģistrēties dalībai, Pievienot pasākumu, Dalībnieki). Izvēlnes punkti izsauc tās pašas metodes kā </w:t>
+            </w:r>
+            <w:r>
+              <w:lastRenderedPageBreak/>
+              <w:t>pogas, un lomām tiek rādīti tikai atļautie punkti.</w:t>
+            </w:r>
+          </w:p>
+        </w:tc>
+        <w:tc>
+          <w:tcPr>
+            <w:tcW w:w="1100" w:type="dxa"/>
+            <w:tcBorders>
+              <w:top w:val="single" w:sz="4" w:space="0" w:color="808080"/>
+              <w:left w:val="single" w:sz="4" w:space="0" w:color="808080"/>
+              <w:bottom w:val="single" w:sz="4" w:space="0" w:color="808080"/>
+              <w:right w:val="single" w:sz="4" w:space="0" w:color="808080"/>
+            </w:tcBorders>
+            <w:tcMar>
+              <w:top w:w="60" w:type="dxa"/>
+              <w:left w:w="80" w:type="dxa"/>
+              <w:bottom w:w="60" w:type="dxa"/>
+              <w:right w:w="80" w:type="dxa"/>
+            </w:tcMar>
+            <w:vAlign w:val="center"/>
+          </w:tcPr>
+          <w:p>
+            <w:pPr>
+              <w:jc w:val="center"/>
+            </w:pPr>
+            <w:r>
+              <w:lastRenderedPageBreak/>
+              <w:t>Novērsta</w:t>
+            </w:r>
+          </w:p>
+        </w:tc>
+      </w:tr>
+      <w:tr>
+        <w:tc>
+          <w:tcPr>
+            <w:tcW w:w="600" w:type="dxa"/>
+            <w:tcBorders>
+              <w:top w:val="single" w:sz="4" w:space="0" w:color="808080"/>
+              <w:left w:val="single" w:sz="4" w:space="0" w:color="808080"/>
+              <w:bottom w:val="single" w:sz="4" w:space="0" w:color="808080"/>
+              <w:right w:val="single" w:sz="4" w:space="0" w:color="808080"/>
+            </w:tcBorders>
+            <w:tcMar>
+              <w:top w:w="60" w:type="dxa"/>
+              <w:left w:w="80" w:type="dxa"/>
+              <w:bottom w:w="60" w:type="dxa"/>
+              <w:right w:w="80" w:type="dxa"/>
+            </w:tcMar>
+            <w:vAlign w:val="center"/>
+          </w:tcPr>
+          <w:p>
+            <w:pPr>
+              <w:jc w:val="center"/>
+            </w:pPr>
+            <w:r>
+              <w:t>20.</w:t>
+            </w:r>
+          </w:p>
+        </w:tc>
+        <w:tc>
+          <w:tcPr>
+            <w:tcW w:w="1250" w:type="dxa"/>
+            <w:tcBorders>
+              <w:top w:val="single" w:sz="4" w:space="0" w:color="808080"/>
+              <w:left w:val="single" w:sz="4" w:space="0" w:color="808080"/>
+              <w:bottom w:val="single" w:sz="4" w:space="0" w:color="808080"/>
+              <w:right w:val="single" w:sz="4" w:space="0" w:color="808080"/>
+            </w:tcBorders>
+            <w:tcMar>
+              <w:top w:w="60" w:type="dxa"/>
+              <w:left w:w="80" w:type="dxa"/>
+              <w:bottom w:w="60" w:type="dxa"/>
+              <w:right w:w="80" w:type="dxa"/>
+            </w:tcMar>
+            <w:vAlign w:val="center"/>
+          </w:tcPr>
+          <w:p>
+            <w:pPr>
+              <w:jc w:val="center"/>
+            </w:pPr>
+            <w:r>
+              <w:t>22.10.2026</w:t>
+            </w:r>
+          </w:p>
+        </w:tc>
+        <w:tc>
+          <w:tcPr>
+            <w:tcW w:w="3900" w:type="dxa"/>
+            <w:tcBorders>
+              <w:top w:val="single" w:sz="4" w:space="0" w:color="808080"/>
+              <w:left w:val="single" w:sz="4" w:space="0" w:color="808080"/>
+              <w:bottom w:val="single" w:sz="4" w:space="0" w:color="808080"/>
+              <w:right w:val="single" w:sz="4" w:space="0" w:color="808080"/>
+            </w:tcBorders>
+            <w:tcMar>
+              <w:top w:w="60" w:type="dxa"/>
+              <w:left w:w="80" w:type="dxa"/>
+              <w:bottom w:w="60" w:type="dxa"/>
+              <w:right w:w="80" w:type="dxa"/>
+            </w:tcMar>
+            <w:vAlign w:val="center"/>
+          </w:tcPr>
+          <w:p>
+            <w:r>
+              <w:t>Projektā ir divi faili ar main metodi (skolotājas piezīme).</w:t>
+            </w:r>
+          </w:p>
+        </w:tc>
+        <w:tc>
+          <w:tcPr>
+            <w:tcW w:w="3300" w:type="dxa"/>
+            <w:tcBorders>
+              <w:top w:val="single" w:sz="4" w:space="0" w:color="808080"/>
+              <w:left w:val="single" w:sz="4" w:space="0" w:color="808080"/>
+              <w:bottom w:val="single" w:sz="4" w:space="0" w:color="808080"/>
+              <w:right w:val="single" w:sz="4" w:space="0" w:color="808080"/>
+            </w:tcBorders>
+            <w:tcMar>
+              <w:top w:w="60" w:type="dxa"/>
+              <w:left w:w="80" w:type="dxa"/>
+              <w:bottom w:w="60" w:type="dxa"/>
+              <w:right w:w="80" w:type="dxa"/>
+            </w:tcMar>
+            <w:vAlign w:val="center"/>
+          </w:tcPr>
+          <w:p>
+            <w:r>
+              <w:t>GitHub repozitorijā bija otrs zars master ar vecu projekta versiju, kurā vēl bija fails EventRegistrationSystem.java ar savu main metodi.</w:t>
+            </w:r>
+          </w:p>
+        </w:tc>
+        <w:tc>
+          <w:tcPr>
+            <w:tcW w:w="3300" w:type="dxa"/>
+            <w:tcBorders>
+              <w:top w:val="single" w:sz="4" w:space="0" w:color="808080"/>
+              <w:left w:val="single" w:sz="4" w:space="0" w:color="808080"/>
+              <w:bottom w:val="single" w:sz="4" w:space="0" w:color="808080"/>
+              <w:right w:val="single" w:sz="4" w:space="0" w:color="808080"/>
+            </w:tcBorders>
+            <w:tcMar>
+              <w:top w:w="60" w:type="dxa"/>
+              <w:left w:w="80" w:type="dxa"/>
+              <w:bottom w:w="60" w:type="dxa"/>
+              <w:right w:w="80" w:type="dxa"/>
+            </w:tcMar>
+            <w:vAlign w:val="center"/>
+          </w:tcPr>
+          <w:p>
+            <w:r>
+              <w:t>Pārbaudīts, ka viss saturs ir zarā main, un zars master izdzēsts gan GitHub, gan lokāli. Projektā palika viena main metode (EventRegistrationSystemGUI).</w:t>
             </w:r>
           </w:p>
         </w:tc>

</xml_diff>